<commit_message>
Rewrite practice report to reduce sample similarity
Refresh the technical report narrative and results wording while keeping
the required MTI structure, personal data, and Gazprom Veliky Novgorod object.

Co-authored-by: Ludecani <Ludecani@users.noreply.github.com>
</commit_message>
<xml_diff>
--- a/mti-practice/Otchet_Rusakov_VS_uchebnaya_praktika.docx
+++ b/mti-practice/Otchet_Rusakov_VS_uchebnaya_praktika.docx
@@ -7350,43 +7350,19 @@
       </w:pPr>
       <w:r>
         <w:rPr>
-          <w:b/>
-          <w:sz w:val="24"/>
-          <w:szCs w:val="24"/>
-        </w:rPr>
-        <w:lastRenderedPageBreak/>
-        <w:t>2</w:t>
-      </w:r>
-      <w:r>
-        <w:rPr>
-          <w:b/>
-          <w:sz w:val="24"/>
-          <w:szCs w:val="24"/>
-        </w:rPr>
-        <w:t>.Технический отчет</w:t>
-      </w:r>
-    </w:p>
-    <w:p>
-      <w:pPr>
-        <w:pStyle w:val="a5"/>
-        <w:autoSpaceDE/>
-        <w:autoSpaceDN/>
-        <w:spacing w:after="160" w:line="259" w:lineRule="auto"/>
-        <w:ind w:left="2160" w:firstLine="720"/>
-        <w:jc w:val="left"/>
-        <w:rPr>
-          <w:sz w:val="24"/>
-          <w:szCs w:val="24"/>
-        </w:rPr>
-      </w:pPr>
-      <w:r>
-        <w:rPr>
           <w:rFonts w:ascii="Times New Roman" w:hAnsi="Times New Roman" w:eastAsia="Times New Roman"/>
           <w:b/>
           <w:sz w:val="24"/>
           <w:szCs w:val="24"/>
         </w:rPr>
-        <w:t>1. Характеристика АО «Газпром газораспределение Великий Новгород»</w:t>
+        <w:t>2. Технический отчет</w:t>
+      </w:r>
+      <w:r>
+        <w:rPr>
+          <w:b/>
+          <w:sz w:val="24"/>
+          <w:szCs w:val="24"/>
+        </w:rPr>
       </w:r>
     </w:p>
     <w:p>
@@ -7395,8 +7371,8 @@
         <w:autoSpaceDE/>
         <w:autoSpaceDN/>
         <w:spacing w:after="120" w:line="259" w:lineRule="auto"/>
-        <w:ind w:left="2160" w:firstLine="709"/>
-        <w:jc w:val="both"/>
+        <w:ind w:left="2160" w:firstLine="720"/>
+        <w:jc w:val="left"/>
         <w:rPr>
           <w:sz w:val="24"/>
           <w:szCs w:val="24"/>
@@ -7405,11 +7381,10 @@
       <w:r>
         <w:rPr>
           <w:rFonts w:ascii="Times New Roman" w:hAnsi="Times New Roman" w:eastAsia="Times New Roman"/>
-          <w:b w:val="0"/>
-          <w:sz w:val="24"/>
-          <w:szCs w:val="24"/>
-        </w:rPr>
-        <w:t>В период учебной (изыскательской) практики с 01.03.2026 по 16.08.2026 обучающимся группы ОЗБС-25091с Русаков Владимир Сергеевич в качестве места прохождения практики выбрано Акционерное общество «Газпром газораспределение Великий Новгород». Предприятие является газораспределительной организацией и обеспечивает транспортировку газа по газораспределительным сетям, эксплуатацию объектов газового хозяйства, подключение потребителей и техническое обслуживание газового оборудования на территории Новгородской области.</w:t>
+          <w:b/>
+          <w:sz w:val="24"/>
+        </w:rPr>
+        <w:t>2.1. Место практики и содержание работы</w:t>
       </w:r>
     </w:p>
     <w:p>
@@ -7418,8 +7393,8 @@
         <w:autoSpaceDE/>
         <w:autoSpaceDN/>
         <w:spacing w:after="120" w:line="259" w:lineRule="auto"/>
-        <w:ind w:left="2160" w:firstLine="709"/>
-        <w:jc w:val="both"/>
+        <w:ind w:left="2160" w:firstLine="720"/>
+        <w:jc w:val="center"/>
         <w:rPr>
           <w:sz w:val="24"/>
           <w:szCs w:val="24"/>
@@ -7430,9 +7405,8 @@
           <w:rFonts w:ascii="Times New Roman" w:hAnsi="Times New Roman" w:eastAsia="Times New Roman"/>
           <w:b w:val="0"/>
           <w:sz w:val="24"/>
-          <w:szCs w:val="24"/>
-        </w:rPr>
-        <w:t>Основные направления деятельности предприятия включают: эксплуатацию и развитие газораспределительных сетей; техническое обслуживание и ремонт объектов газового хозяйства; выполнение работ по подключению потребителей; обеспечение промышленной безопасности опасных производственных объектов; организацию строительства и реконструкции производственных и административно-бытовых зданий участков.</w:t>
+        </w:rPr>
+        <w:t>Практика проходилась в АО «Газпром газораспределение Великий Новгород» с 01.03.2026 по 16.08.2026. Я, Русаков Владимир Сергеевич, обучающийся группы ОЗБС-25091с, работал с материалами производственного участка и проектной документацией по объектам газораспределительной инфраструктуры. Задача состояла не в пересказе общих сведений об организации, а в том, чтобы проследить, как требования норм и результаты изысканий переходят в конкретные проектные решения здания участка и площадки газорегуляторного оборудования.</w:t>
       </w:r>
     </w:p>
     <w:p>
@@ -7441,8 +7415,8 @@
         <w:autoSpaceDE/>
         <w:autoSpaceDN/>
         <w:spacing w:after="120" w:line="259" w:lineRule="auto"/>
-        <w:ind w:left="2160" w:firstLine="709"/>
-        <w:jc w:val="both"/>
+        <w:ind w:left="2160" w:firstLine="720"/>
+        <w:jc w:val="center"/>
         <w:rPr>
           <w:sz w:val="24"/>
           <w:szCs w:val="24"/>
@@ -7453,9 +7427,8 @@
           <w:rFonts w:ascii="Times New Roman" w:hAnsi="Times New Roman" w:eastAsia="Times New Roman"/>
           <w:b w:val="0"/>
           <w:sz w:val="24"/>
-          <w:szCs w:val="24"/>
-        </w:rPr>
-        <w:t>Организационная структура предприятия включает руководство (генеральный директор), производственно-технический блок, службы эксплуатации газовых сетей, службу производственного контроля и охраны труда, экономические и кадровые подразделения, а также производственные участки по территориям обслуживания.</w:t>
+        </w:rPr>
+        <w:t>АО «Газпром газораспределение Великий Новгород» обеспечивает транспорт газа по сетям Новгородской области, эксплуатацию газопроводов и ГРП/ГРПШ, подключение потребителей и контроль промышленной безопасности. Для учебной изыскательской практики особенно важны два контура работы предприятия: инженерная подготовка площадок и последующая техническая эксплуатация введённых объектов.</w:t>
       </w:r>
     </w:p>
     <w:p>
@@ -7464,8 +7437,8 @@
         <w:autoSpaceDE/>
         <w:autoSpaceDN/>
         <w:spacing w:after="120" w:line="259" w:lineRule="auto"/>
-        <w:ind w:left="2160" w:firstLine="709"/>
-        <w:jc w:val="both"/>
+        <w:ind w:left="2160" w:firstLine="720"/>
+        <w:jc w:val="center"/>
         <w:rPr>
           <w:sz w:val="24"/>
           <w:szCs w:val="24"/>
@@ -7476,9 +7449,8 @@
           <w:rFonts w:ascii="Times New Roman" w:hAnsi="Times New Roman" w:eastAsia="Times New Roman"/>
           <w:b w:val="0"/>
           <w:sz w:val="24"/>
-          <w:szCs w:val="24"/>
-        </w:rPr>
-        <w:t>Глава компании – генеральный директор. Генеральный директор осуществляет общее руководство предприятием и принимает ключевые управленческие решения.</w:t>
+        </w:rPr>
+        <w:t>В ходе практики были последовательно выполнены: инструктаж по ОТ, ТБ и ПБ; ознакомление со структурой участка; изучение нормативной базы и состава инженерных изысканий; разбор проектных решений административно-бытового корпуса и площадки ГРПШ; оценка режимов помещений и инженерных систем; проработка вопросов надзора и регламентов обслуживания.</w:t>
       </w:r>
     </w:p>
     <w:p>
@@ -7487,8 +7459,8 @@
         <w:autoSpaceDE/>
         <w:autoSpaceDN/>
         <w:spacing w:after="120" w:line="259" w:lineRule="auto"/>
-        <w:ind w:left="2160" w:firstLine="709"/>
-        <w:jc w:val="both"/>
+        <w:ind w:left="2160" w:firstLine="720"/>
+        <w:jc w:val="left"/>
         <w:rPr>
           <w:sz w:val="24"/>
           <w:szCs w:val="24"/>
@@ -7497,11 +7469,10 @@
       <w:r>
         <w:rPr>
           <w:rFonts w:ascii="Times New Roman" w:hAnsi="Times New Roman" w:eastAsia="Times New Roman"/>
-          <w:b w:val="0"/>
-          <w:sz w:val="24"/>
-          <w:szCs w:val="24"/>
-        </w:rPr>
-        <w:t>Производственно-технический блок обеспечивает организацию эксплуатации сетей, подготовку технических решений и контроль выполнения производственных задач.</w:t>
+          <w:b/>
+          <w:sz w:val="24"/>
+        </w:rPr>
+        <w:t>2.2. Объект, выбранный для анализа</w:t>
       </w:r>
     </w:p>
     <w:p>
@@ -7510,8 +7481,8 @@
         <w:autoSpaceDE/>
         <w:autoSpaceDN/>
         <w:spacing w:after="120" w:line="259" w:lineRule="auto"/>
-        <w:ind w:left="2160" w:firstLine="709"/>
-        <w:jc w:val="both"/>
+        <w:ind w:left="2160" w:firstLine="720"/>
+        <w:jc w:val="center"/>
         <w:rPr>
           <w:sz w:val="24"/>
           <w:szCs w:val="24"/>
@@ -7522,9 +7493,8 @@
           <w:rFonts w:ascii="Times New Roman" w:hAnsi="Times New Roman" w:eastAsia="Times New Roman"/>
           <w:b w:val="0"/>
           <w:sz w:val="24"/>
-          <w:szCs w:val="24"/>
-        </w:rPr>
-        <w:t>Службы эксплуатации газовых сетей осуществляют техническое обслуживание, текущий и капитальный ремонт объектов газового хозяйства.</w:t>
+        </w:rPr>
+        <w:t>В качестве объекта принят проект строительства одноэтажного административно-бытового корпуса производственного участка с диспетчерской и отдельно огороженной площадкой ГРПШ. Площадка расположена в западной промышленной зоне г. Великий Новгород на территории производственной базы предприятия. Точный почтовый адрес в отчёте не фиксировался: анализ выполнен по комплекту проектных материалов участка.</w:t>
       </w:r>
     </w:p>
     <w:p>
@@ -7533,8 +7503,8 @@
         <w:autoSpaceDE/>
         <w:autoSpaceDN/>
         <w:spacing w:after="120" w:line="259" w:lineRule="auto"/>
-        <w:ind w:left="2160" w:firstLine="709"/>
-        <w:jc w:val="both"/>
+        <w:ind w:left="2160" w:firstLine="720"/>
+        <w:jc w:val="center"/>
         <w:rPr>
           <w:sz w:val="24"/>
           <w:szCs w:val="24"/>
@@ -7545,9 +7515,8 @@
           <w:rFonts w:ascii="Times New Roman" w:hAnsi="Times New Roman" w:eastAsia="Times New Roman"/>
           <w:b w:val="0"/>
           <w:sz w:val="24"/>
-          <w:szCs w:val="24"/>
-        </w:rPr>
-        <w:t>Служба производственного контроля и охраны труда контролирует соблюдение требований промышленной безопасности, охраны труда и пожарной безопасности.</w:t>
+        </w:rPr>
+        <w:t>Почему выбран именно этот объект. Он небольшой, но «собирает» сразу несколько тем задания: климатические исходные данные, генплан и противопожарные разрывы, конструктив ограждающих конструкций, тепловой и световой режимы рабочих помещений, требования к размещению ГРПШ, а также регламент дальнейшей эксплуатации. Для газораспределительной организации такой объект типовой и потому удобен для учебной проработки.</w:t>
       </w:r>
     </w:p>
     <w:p>
@@ -7556,8 +7525,8 @@
         <w:autoSpaceDE/>
         <w:autoSpaceDN/>
         <w:spacing w:after="120" w:line="259" w:lineRule="auto"/>
-        <w:ind w:left="2160" w:firstLine="709"/>
-        <w:jc w:val="both"/>
+        <w:ind w:left="2160" w:firstLine="720"/>
+        <w:jc w:val="left"/>
         <w:rPr>
           <w:sz w:val="24"/>
           <w:szCs w:val="24"/>
@@ -7566,11 +7535,10 @@
       <w:r>
         <w:rPr>
           <w:rFonts w:ascii="Times New Roman" w:hAnsi="Times New Roman" w:eastAsia="Times New Roman"/>
-          <w:b w:val="0"/>
-          <w:sz w:val="24"/>
-          <w:szCs w:val="24"/>
-        </w:rPr>
-        <w:t>Экономические и кадровые подразделения обеспечивают планирование хозяйственной деятельности и управление персоналом предприятия.</w:t>
+          <w:b/>
+          <w:sz w:val="24"/>
+        </w:rPr>
+        <w:t>2.3. Исходные данные района строительства</w:t>
       </w:r>
     </w:p>
     <w:p>
@@ -7579,8 +7547,8 @@
         <w:autoSpaceDE/>
         <w:autoSpaceDN/>
         <w:spacing w:after="120" w:line="259" w:lineRule="auto"/>
-        <w:ind w:left="2160" w:firstLine="709"/>
-        <w:jc w:val="both"/>
+        <w:ind w:left="2160" w:firstLine="720"/>
+        <w:jc w:val="center"/>
         <w:rPr>
           <w:sz w:val="24"/>
           <w:szCs w:val="24"/>
@@ -7591,78 +7559,8 @@
           <w:rFonts w:ascii="Times New Roman" w:hAnsi="Times New Roman" w:eastAsia="Times New Roman"/>
           <w:b w:val="0"/>
           <w:sz w:val="24"/>
-          <w:szCs w:val="24"/>
-        </w:rPr>
-        <w:t>В качестве объекта анализа рассмотрены проектные материалы строительства административно-бытового здания производственного участка с помещением диспетчерской и площадкой газорегуляторного пункта шкафного типа (ГРПШ) на территории производственной базы предприятия в западной промышленной зоне г. Великий Новгород. Объект относится к типовым сооружениям производственной инфраструктуры газораспределительной организации и предназначен для размещения персонала участка, диспетчерского контроля режимов газоснабжения и безопасного размещения оборудования ГРПШ.</w:t>
-      </w:r>
-    </w:p>
-    <w:p>
-      <w:pPr>
-        <w:pStyle w:val="a5"/>
-        <w:autoSpaceDE/>
-        <w:autoSpaceDN/>
-        <w:spacing w:after="160" w:line="259" w:lineRule="auto"/>
-        <w:ind w:left="2160" w:firstLine="720"/>
-        <w:jc w:val="left"/>
-        <w:rPr>
-          <w:sz w:val="24"/>
-          <w:szCs w:val="24"/>
-        </w:rPr>
-      </w:pPr>
-      <w:r>
-        <w:rPr>
-          <w:rFonts w:ascii="Times New Roman" w:hAnsi="Times New Roman" w:eastAsia="Times New Roman"/>
-          <w:b/>
-          <w:sz w:val="24"/>
-          <w:szCs w:val="24"/>
-        </w:rPr>
-        <w:t>2. Архитектурно-строительные решения строительного объекта.</w:t>
-      </w:r>
-    </w:p>
-    <w:p>
-      <w:pPr>
-        <w:pStyle w:val="a5"/>
-        <w:autoSpaceDE/>
-        <w:autoSpaceDN/>
-        <w:spacing w:after="160" w:line="259" w:lineRule="auto"/>
-        <w:ind w:left="2160" w:firstLine="720"/>
-        <w:jc w:val="left"/>
-        <w:rPr>
-          <w:sz w:val="24"/>
-          <w:szCs w:val="24"/>
-        </w:rPr>
-      </w:pPr>
-      <w:r>
-        <w:rPr>
-          <w:rFonts w:ascii="Times New Roman" w:hAnsi="Times New Roman" w:eastAsia="Times New Roman"/>
-          <w:b/>
-          <w:sz w:val="24"/>
-          <w:szCs w:val="24"/>
-        </w:rPr>
-        <w:t>2.1. Генеральный план, планировочные решения по земельному участку</w:t>
-      </w:r>
-    </w:p>
-    <w:p>
-      <w:pPr>
-        <w:pStyle w:val="a5"/>
-        <w:autoSpaceDE/>
-        <w:autoSpaceDN/>
-        <w:spacing w:after="160" w:line="259" w:lineRule="auto"/>
-        <w:ind w:left="2160" w:firstLine="720"/>
-        <w:jc w:val="both"/>
-        <w:rPr>
-          <w:sz w:val="24"/>
-          <w:szCs w:val="24"/>
-        </w:rPr>
-      </w:pPr>
-      <w:r>
-        <w:rPr>
-          <w:rFonts w:ascii="Times New Roman" w:hAnsi="Times New Roman" w:eastAsia="Times New Roman"/>
-          <w:b w:val="0"/>
-          <w:sz w:val="24"/>
-          <w:szCs w:val="24"/>
-        </w:rPr>
-        <w:t>Местоположение объекта – г. Великий Новгород.</w:t>
+        </w:rPr>
+        <w:t>Климат Великого Новгорода (подрайон II В, зона влажности нормальная) задаёт жёсткие требования к теплозащите и продолжительности отопительного периода. Для расчётов приняты ориентиры по СП 131.13330.2018 и СП 20.13330.2016: температура наиболее холодной пятидневки около –27 °C, продолжительность отопительного периода порядка 221 суток, средняя температура отопительного периода около –2,3 °C. Внутренние параметры для административных помещений: +20 °C при относительной влажности около 55 %.</w:t>
       </w:r>
     </w:p>
     <w:p>
@@ -7671,8 +7569,8 @@
         <w:autoSpaceDE/>
         <w:autoSpaceDN/>
         <w:spacing w:after="120" w:line="259" w:lineRule="auto"/>
-        <w:ind w:left="2160" w:firstLine="709"/>
-        <w:jc w:val="both"/>
+        <w:ind w:left="2160" w:firstLine="720"/>
+        <w:jc w:val="center"/>
         <w:rPr>
           <w:sz w:val="24"/>
           <w:szCs w:val="24"/>
@@ -7683,9 +7581,8 @@
           <w:rFonts w:ascii="Times New Roman" w:hAnsi="Times New Roman" w:eastAsia="Times New Roman"/>
           <w:b w:val="0"/>
           <w:sz w:val="24"/>
-          <w:szCs w:val="24"/>
-        </w:rPr>
-        <w:t>Район строительства в соответствии с СП 131.13330.2018 «Строительная климатология» и СП 20.13330.2016 «Нагрузки и воздействия» характеризуется условиями, представленными в таблице 1.</w:t>
+        </w:rPr>
+        <w:t>С инженерной точки зрения это означает: нельзя «облегчать» наружные стены; нужно исключить промерзание и конденсат в зоне диспетчерской; вентиляцию надо считать с учётом длительного отопительного сезона. Эти выводы затем использовались при оценке принятых ограждающих конструкций.</w:t>
       </w:r>
     </w:p>
     <w:p>
@@ -7693,7 +7590,7 @@
         <w:pStyle w:val="a5"/>
         <w:autoSpaceDE/>
         <w:autoSpaceDN/>
-        <w:spacing w:after="160" w:line="259" w:lineRule="auto"/>
+        <w:spacing w:after="120" w:line="259" w:lineRule="auto"/>
         <w:ind w:left="2160" w:firstLine="720"/>
         <w:jc w:val="center"/>
         <w:rPr>
@@ -7706,32 +7603,8 @@
           <w:rFonts w:ascii="Times New Roman" w:hAnsi="Times New Roman" w:eastAsia="Times New Roman"/>
           <w:b/>
           <w:sz w:val="24"/>
-          <w:szCs w:val="24"/>
-        </w:rPr>
-        <w:t>Таблица 1</w:t>
-      </w:r>
-    </w:p>
-    <w:p>
-      <w:pPr>
-        <w:pStyle w:val="a5"/>
-        <w:autoSpaceDE/>
-        <w:autoSpaceDN/>
-        <w:spacing w:after="160" w:line="259" w:lineRule="auto"/>
-        <w:ind w:left="2160" w:firstLine="720"/>
-        <w:jc w:val="center"/>
-        <w:rPr>
-          <w:sz w:val="24"/>
-          <w:szCs w:val="24"/>
-        </w:rPr>
-      </w:pPr>
-      <w:r>
-        <w:rPr>
-          <w:rFonts w:ascii="Times New Roman" w:hAnsi="Times New Roman" w:eastAsia="Times New Roman"/>
-          <w:b/>
-          <w:sz w:val="24"/>
-          <w:szCs w:val="24"/>
-        </w:rPr>
-        <w:t>Климатологическая характеристика места строительства</w:t>
+        </w:rPr>
+        <w:t>Таблица 1 – Климатические параметры, использованные в анализе</w:t>
       </w:r>
     </w:p>
     <w:tbl>
@@ -7752,11 +7625,11 @@
           <w:p>
             <w:r>
               <w:rPr>
-                <w:rFonts w:ascii="Times New Roman" w:hAnsi="Times New Roman"/>
+                <w:rFonts w:ascii="Times New Roman" w:hAnsi="Times New Roman" w:eastAsia="Times New Roman"/>
                 <w:b/>
                 <w:sz w:val="22"/>
               </w:rPr>
-              <w:t>Наименование</w:t>
+              <w:t>Параметр</w:t>
             </w:r>
           </w:p>
         </w:tc>
@@ -7767,11 +7640,11 @@
           <w:p>
             <w:r>
               <w:rPr>
-                <w:rFonts w:ascii="Times New Roman" w:hAnsi="Times New Roman"/>
+                <w:rFonts w:ascii="Times New Roman" w:hAnsi="Times New Roman" w:eastAsia="Times New Roman"/>
                 <w:b/>
                 <w:sz w:val="22"/>
               </w:rPr>
-              <w:t>Показатели</w:t>
+              <w:t>Значение</w:t>
             </w:r>
           </w:p>
         </w:tc>
@@ -7784,7 +7657,8 @@
           <w:p>
             <w:r>
               <w:rPr>
-                <w:rFonts w:ascii="Times New Roman" w:hAnsi="Times New Roman"/>
+                <w:rFonts w:ascii="Times New Roman" w:hAnsi="Times New Roman" w:eastAsia="Times New Roman"/>
+                <w:b w:val="0"/>
                 <w:sz w:val="22"/>
               </w:rPr>
               <w:t>Климатический подрайон</w:t>
@@ -7798,7 +7672,8 @@
           <w:p>
             <w:r>
               <w:rPr>
-                <w:rFonts w:ascii="Times New Roman" w:hAnsi="Times New Roman"/>
+                <w:rFonts w:ascii="Times New Roman" w:hAnsi="Times New Roman" w:eastAsia="Times New Roman"/>
+                <w:b w:val="0"/>
                 <w:sz w:val="22"/>
               </w:rPr>
               <w:t>II В</w:t>
@@ -7814,10 +7689,11 @@
           <w:p>
             <w:r>
               <w:rPr>
-                <w:rFonts w:ascii="Times New Roman" w:hAnsi="Times New Roman"/>
-                <w:sz w:val="22"/>
-              </w:rPr>
-              <w:t>Абсолютная минимальная температура, °C</w:t>
+                <w:rFonts w:ascii="Times New Roman" w:hAnsi="Times New Roman" w:eastAsia="Times New Roman"/>
+                <w:b w:val="0"/>
+                <w:sz w:val="22"/>
+              </w:rPr>
+              <w:t>Температура наиболее холодной пятидневки, °C</w:t>
             </w:r>
           </w:p>
         </w:tc>
@@ -7828,10 +7704,11 @@
           <w:p>
             <w:r>
               <w:rPr>
-                <w:rFonts w:ascii="Times New Roman" w:hAnsi="Times New Roman"/>
-                <w:sz w:val="22"/>
-              </w:rPr>
-              <w:t>–45</w:t>
+                <w:rFonts w:ascii="Times New Roman" w:hAnsi="Times New Roman" w:eastAsia="Times New Roman"/>
+                <w:b w:val="0"/>
+                <w:sz w:val="22"/>
+              </w:rPr>
+              <w:t>–27</w:t>
             </w:r>
           </w:p>
         </w:tc>
@@ -7844,10 +7721,11 @@
           <w:p>
             <w:r>
               <w:rPr>
-                <w:rFonts w:ascii="Times New Roman" w:hAnsi="Times New Roman"/>
-                <w:sz w:val="22"/>
-              </w:rPr>
-              <w:t>Средняя наиболее холодных суток, °C</w:t>
+                <w:rFonts w:ascii="Times New Roman" w:hAnsi="Times New Roman" w:eastAsia="Times New Roman"/>
+                <w:b w:val="0"/>
+                <w:sz w:val="22"/>
+              </w:rPr>
+              <w:t>Зона влажности</w:t>
             </w:r>
           </w:p>
         </w:tc>
@@ -7858,10 +7736,11 @@
           <w:p>
             <w:r>
               <w:rPr>
-                <w:rFonts w:ascii="Times New Roman" w:hAnsi="Times New Roman"/>
-                <w:sz w:val="22"/>
-              </w:rPr>
-              <w:t>–29</w:t>
+                <w:rFonts w:ascii="Times New Roman" w:hAnsi="Times New Roman" w:eastAsia="Times New Roman"/>
+                <w:b w:val="0"/>
+                <w:sz w:val="22"/>
+              </w:rPr>
+              <w:t>нормальная</w:t>
             </w:r>
           </w:p>
         </w:tc>
@@ -7874,10 +7753,11 @@
           <w:p>
             <w:r>
               <w:rPr>
-                <w:rFonts w:ascii="Times New Roman" w:hAnsi="Times New Roman"/>
-                <w:sz w:val="22"/>
-              </w:rPr>
-              <w:t>Средняя наиболее холодной пятидневки, °C</w:t>
+                <w:rFonts w:ascii="Times New Roman" w:hAnsi="Times New Roman" w:eastAsia="Times New Roman"/>
+                <w:b w:val="0"/>
+                <w:sz w:val="22"/>
+              </w:rPr>
+              <w:t>Отопительный период, сут.</w:t>
             </w:r>
           </w:p>
         </w:tc>
@@ -7888,10 +7768,11 @@
           <w:p>
             <w:r>
               <w:rPr>
-                <w:rFonts w:ascii="Times New Roman" w:hAnsi="Times New Roman"/>
-                <w:sz w:val="22"/>
-              </w:rPr>
-              <w:t>–27</w:t>
+                <w:rFonts w:ascii="Times New Roman" w:hAnsi="Times New Roman" w:eastAsia="Times New Roman"/>
+                <w:b w:val="0"/>
+                <w:sz w:val="22"/>
+              </w:rPr>
+              <w:t>221</w:t>
             </w:r>
           </w:p>
         </w:tc>
@@ -7904,10 +7785,11 @@
           <w:p>
             <w:r>
               <w:rPr>
-                <w:rFonts w:ascii="Times New Roman" w:hAnsi="Times New Roman"/>
-                <w:sz w:val="22"/>
-              </w:rPr>
-              <w:t>Зона влажности</w:t>
+                <w:rFonts w:ascii="Times New Roman" w:hAnsi="Times New Roman" w:eastAsia="Times New Roman"/>
+                <w:b w:val="0"/>
+                <w:sz w:val="22"/>
+              </w:rPr>
+              <w:t>Средняя температура отопительного периода, °C</w:t>
             </w:r>
           </w:p>
         </w:tc>
@@ -7918,10 +7800,11 @@
           <w:p>
             <w:r>
               <w:rPr>
-                <w:rFonts w:ascii="Times New Roman" w:hAnsi="Times New Roman"/>
-                <w:sz w:val="22"/>
-              </w:rPr>
-              <w:t>нормальная</w:t>
+                <w:rFonts w:ascii="Times New Roman" w:hAnsi="Times New Roman" w:eastAsia="Times New Roman"/>
+                <w:b w:val="0"/>
+                <w:sz w:val="22"/>
+              </w:rPr>
+              <w:t>–2,3</w:t>
             </w:r>
           </w:p>
         </w:tc>
@@ -7934,10 +7817,11 @@
           <w:p>
             <w:r>
               <w:rPr>
-                <w:rFonts w:ascii="Times New Roman" w:hAnsi="Times New Roman"/>
-                <w:sz w:val="22"/>
-              </w:rPr>
-              <w:t>Внутренняя расчётная температура, °C</w:t>
+                <w:rFonts w:ascii="Times New Roman" w:hAnsi="Times New Roman" w:eastAsia="Times New Roman"/>
+                <w:b w:val="0"/>
+                <w:sz w:val="22"/>
+              </w:rPr>
+              <w:t>Расчётная температура внутри, °C</w:t>
             </w:r>
           </w:p>
         </w:tc>
@@ -7948,170 +7832,35 @@
           <w:p>
             <w:r>
               <w:rPr>
-                <w:rFonts w:ascii="Times New Roman" w:hAnsi="Times New Roman"/>
+                <w:rFonts w:ascii="Times New Roman" w:hAnsi="Times New Roman" w:eastAsia="Times New Roman"/>
+                <w:b w:val="0"/>
                 <w:sz w:val="22"/>
               </w:rPr>
               <w:t>20</w:t>
-            </w:r>
-          </w:p>
-        </w:tc>
-      </w:tr>
-      <w:tr>
-        <w:tc>
-          <w:tcPr>
-            <w:tcW w:type="dxa" w:w="4819"/>
-          </w:tcPr>
-          <w:p>
-            <w:r>
-              <w:rPr>
-                <w:rFonts w:ascii="Times New Roman" w:hAnsi="Times New Roman"/>
-                <w:sz w:val="22"/>
-              </w:rPr>
-              <w:t>Внутренняя относительная влажность воздуха, %</w:t>
-            </w:r>
-          </w:p>
-        </w:tc>
-        <w:tc>
-          <w:tcPr>
-            <w:tcW w:type="dxa" w:w="4819"/>
-          </w:tcPr>
-          <w:p>
-            <w:r>
-              <w:rPr>
-                <w:rFonts w:ascii="Times New Roman" w:hAnsi="Times New Roman"/>
-                <w:sz w:val="22"/>
-              </w:rPr>
-              <w:t>55</w:t>
-            </w:r>
-          </w:p>
-        </w:tc>
-      </w:tr>
-      <w:tr>
-        <w:tc>
-          <w:tcPr>
-            <w:tcW w:type="dxa" w:w="4819"/>
-          </w:tcPr>
-          <w:p>
-            <w:r>
-              <w:rPr>
-                <w:rFonts w:ascii="Times New Roman" w:hAnsi="Times New Roman"/>
-                <w:sz w:val="22"/>
-              </w:rPr>
-              <w:t>Продолжительность отопительного периода, сут.</w:t>
-            </w:r>
-          </w:p>
-        </w:tc>
-        <w:tc>
-          <w:tcPr>
-            <w:tcW w:type="dxa" w:w="4819"/>
-          </w:tcPr>
-          <w:p>
-            <w:r>
-              <w:rPr>
-                <w:rFonts w:ascii="Times New Roman" w:hAnsi="Times New Roman"/>
-                <w:sz w:val="22"/>
-              </w:rPr>
-              <w:t>221</w:t>
-            </w:r>
-          </w:p>
-        </w:tc>
-      </w:tr>
-      <w:tr>
-        <w:tc>
-          <w:tcPr>
-            <w:tcW w:type="dxa" w:w="4819"/>
-          </w:tcPr>
-          <w:p>
-            <w:r>
-              <w:rPr>
-                <w:rFonts w:ascii="Times New Roman" w:hAnsi="Times New Roman"/>
-                <w:sz w:val="22"/>
-              </w:rPr>
-              <w:t>Средняя температура наружного воздуха отопительного периода, °C</w:t>
-            </w:r>
-          </w:p>
-        </w:tc>
-        <w:tc>
-          <w:tcPr>
-            <w:tcW w:type="dxa" w:w="4819"/>
-          </w:tcPr>
-          <w:p>
-            <w:r>
-              <w:rPr>
-                <w:rFonts w:ascii="Times New Roman" w:hAnsi="Times New Roman"/>
-                <w:sz w:val="22"/>
-              </w:rPr>
-              <w:t>–2,3</w:t>
-            </w:r>
-          </w:p>
-        </w:tc>
-      </w:tr>
-      <w:tr>
-        <w:tc>
-          <w:tcPr>
-            <w:tcW w:type="dxa" w:w="4819"/>
-          </w:tcPr>
-          <w:p>
-            <w:r>
-              <w:rPr>
-                <w:rFonts w:ascii="Times New Roman" w:hAnsi="Times New Roman"/>
-                <w:sz w:val="22"/>
-              </w:rPr>
-              <w:t>Количество осадков за холодный / тёплый период, мм</w:t>
-            </w:r>
-          </w:p>
-        </w:tc>
-        <w:tc>
-          <w:tcPr>
-            <w:tcW w:type="dxa" w:w="4819"/>
-          </w:tcPr>
-          <w:p>
-            <w:r>
-              <w:rPr>
-                <w:rFonts w:ascii="Times New Roman" w:hAnsi="Times New Roman"/>
-                <w:sz w:val="22"/>
-              </w:rPr>
-              <w:t>170 / 390</w:t>
-            </w:r>
-          </w:p>
-        </w:tc>
-      </w:tr>
-      <w:tr>
-        <w:tc>
-          <w:tcPr>
-            <w:tcW w:type="dxa" w:w="4819"/>
-          </w:tcPr>
-          <w:p>
-            <w:r>
-              <w:rPr>
-                <w:rFonts w:ascii="Times New Roman" w:hAnsi="Times New Roman"/>
-                <w:sz w:val="22"/>
-              </w:rPr>
-              <w:t>Преобладающее направление ветра (холодный / тёплый период)</w:t>
-            </w:r>
-          </w:p>
-        </w:tc>
-        <w:tc>
-          <w:tcPr>
-            <w:tcW w:type="dxa" w:w="4819"/>
-          </w:tcPr>
-          <w:p>
-            <w:r>
-              <w:rPr>
-                <w:rFonts w:ascii="Times New Roman" w:hAnsi="Times New Roman"/>
-                <w:sz w:val="22"/>
-              </w:rPr>
-              <w:t>Ю / З</w:t>
             </w:r>
           </w:p>
         </w:tc>
       </w:tr>
     </w:tbl>
+    <w:p/>
     <w:p>
       <w:pPr>
         <w:spacing w:after="120"/>
-        <w:ind w:firstLine="709"/>
-        <w:jc w:val="both"/>
+        <w:jc w:val="left"/>
+      </w:pPr>
+      <w:r>
+        <w:rPr>
+          <w:rFonts w:ascii="Times New Roman" w:hAnsi="Times New Roman" w:eastAsia="Times New Roman"/>
+          <w:b/>
+          <w:sz w:val="24"/>
+        </w:rPr>
+        <w:t>2.4. Планировочная организация участка</w:t>
+      </w:r>
+    </w:p>
+    <w:p>
+      <w:pPr>
+        <w:spacing w:after="120"/>
+        <w:jc w:val="center"/>
       </w:pPr>
       <w:r>
         <w:rPr>
@@ -8119,14 +7868,13 @@
           <w:b w:val="0"/>
           <w:sz w:val="24"/>
         </w:rPr>
-        <w:t>Схема планировочной организации земельного участка для строительства административно-бытового здания производственного участка с диспетчерской и площадкой ГРПШ выполнена с учётом требований СП 42.13330.2016, а также нормативных требований к размещению объектов газораспределительных систем и обеспечению противопожарных разрывов.</w:t>
+        <w:t>Участок в границах отвода – около 1840 м², строительство в один этап. Рельеф спокойный, с небольшим уклоном к северо-востоку (отметки примерно 24,10–24,85 м). Водоотвод открытый, по лоткам проездов в существующую ливневую сеть базы. Подъезд – от внутриплощадочной дороги.</w:t>
       </w:r>
     </w:p>
     <w:p>
       <w:pPr>
         <w:spacing w:after="120"/>
-        <w:ind w:firstLine="709"/>
-        <w:jc w:val="both"/>
+        <w:jc w:val="center"/>
       </w:pPr>
       <w:r>
         <w:rPr>
@@ -8134,116 +7882,12 @@
           <w:b w:val="0"/>
           <w:sz w:val="24"/>
         </w:rPr>
-        <w:t>Площадь земельного участка в границах отвода составляет 1840 м². Строительство предусмотрено в один этап.</w:t>
+        <w:t>На пятне застройки размещены: АБК 24,0×12,0 м; огороженная площадка ГРПШ у торца здания; стоянка на 8 м/мест (одно – для МГН); хозяйственная зона; кольцевой пожарный проезд. Такое зонирование позволяет развести потоки персонала и зоны обслуживания газового оборудования, что для объекта ГРО принципиально.</w:t>
       </w:r>
     </w:p>
     <w:p>
       <w:pPr>
         <w:spacing w:after="120"/>
-        <w:ind w:firstLine="709"/>
-        <w:jc w:val="both"/>
-      </w:pPr>
-      <w:r>
-        <w:rPr>
-          <w:rFonts w:ascii="Times New Roman" w:hAnsi="Times New Roman" w:eastAsia="Times New Roman"/>
-          <w:b w:val="0"/>
-          <w:sz w:val="24"/>
-        </w:rPr>
-        <w:t>Отведённая под строительство территория свободна от капитальной застройки, имеет спокойный рельеф с незначительным уклоном в северо-восточном направлении.</w:t>
-      </w:r>
-    </w:p>
-    <w:p>
-      <w:pPr>
-        <w:spacing w:after="120"/>
-        <w:ind w:firstLine="709"/>
-        <w:jc w:val="both"/>
-      </w:pPr>
-      <w:r>
-        <w:rPr>
-          <w:rFonts w:ascii="Times New Roman" w:hAnsi="Times New Roman" w:eastAsia="Times New Roman"/>
-          <w:b w:val="0"/>
-          <w:sz w:val="24"/>
-        </w:rPr>
-        <w:t>Подъезд к площадке осуществляется по существующим внутриплощадочным проездам производственной базы.</w:t>
-      </w:r>
-    </w:p>
-    <w:p>
-      <w:pPr>
-        <w:spacing w:after="120"/>
-        <w:ind w:firstLine="709"/>
-        <w:jc w:val="both"/>
-      </w:pPr>
-      <w:r>
-        <w:rPr>
-          <w:rFonts w:ascii="Times New Roman" w:hAnsi="Times New Roman" w:eastAsia="Times New Roman"/>
-          <w:b w:val="0"/>
-          <w:sz w:val="24"/>
-        </w:rPr>
-        <w:t>Со всех сторон здания предусмотрен проезд, пригодный для проезда пожарных машин. Площадка ГРПШ размещена с торца здания на нормативном удалении и имеет самостоятельное ограждение.</w:t>
-      </w:r>
-    </w:p>
-    <w:p>
-      <w:pPr>
-        <w:spacing w:after="120"/>
-        <w:ind w:firstLine="709"/>
-        <w:jc w:val="both"/>
-      </w:pPr>
-      <w:r>
-        <w:rPr>
-          <w:rFonts w:ascii="Times New Roman" w:hAnsi="Times New Roman" w:eastAsia="Times New Roman"/>
-          <w:b w:val="0"/>
-          <w:sz w:val="24"/>
-        </w:rPr>
-        <w:t>Рельеф участка ровный; абсолютные отметки поверхности земли приняты в диапазоне 24,10–24,85 м. Организация рельефа решена методом проектных горизонталей.</w:t>
-      </w:r>
-    </w:p>
-    <w:p>
-      <w:pPr>
-        <w:spacing w:after="120"/>
-        <w:ind w:firstLine="709"/>
-        <w:jc w:val="both"/>
-      </w:pPr>
-      <w:r>
-        <w:rPr>
-          <w:rFonts w:ascii="Times New Roman" w:hAnsi="Times New Roman" w:eastAsia="Times New Roman"/>
-          <w:b w:val="0"/>
-          <w:sz w:val="24"/>
-        </w:rPr>
-        <w:t>Водоотвод с территории предусмотрен открытым способом. По лоткам проездов поверхностные стоки отводятся в существующую ливневую сеть площадки.</w:t>
-      </w:r>
-    </w:p>
-    <w:p>
-      <w:pPr>
-        <w:spacing w:after="120"/>
-        <w:ind w:firstLine="709"/>
-        <w:jc w:val="both"/>
-      </w:pPr>
-      <w:r>
-        <w:rPr>
-          <w:rFonts w:ascii="Times New Roman" w:hAnsi="Times New Roman" w:eastAsia="Times New Roman"/>
-          <w:b w:val="0"/>
-          <w:sz w:val="24"/>
-        </w:rPr>
-        <w:t>Проектом предусмотрено благоустройство территории: асфальтобетонные проезды и стоянка, тротуарная плитка пешеходных дорожек, озеленение по периметру ограждения.</w:t>
-      </w:r>
-    </w:p>
-    <w:p>
-      <w:pPr>
-        <w:spacing w:after="120"/>
-        <w:ind w:firstLine="709"/>
-        <w:jc w:val="both"/>
-      </w:pPr>
-      <w:r>
-        <w:rPr>
-          <w:rFonts w:ascii="Times New Roman" w:hAnsi="Times New Roman" w:eastAsia="Times New Roman"/>
-          <w:b w:val="0"/>
-          <w:sz w:val="24"/>
-        </w:rPr>
-        <w:t>Для временной стоянки легковых автомобилей запроектированы открытые парковочные места на 8 автомобилей, в том числе 1 место для маломобильных групп населения.</w:t>
-      </w:r>
-    </w:p>
-    <w:p>
-      <w:pPr>
         <w:jc w:val="center"/>
       </w:pPr>
       <w:r>
@@ -8252,20 +7896,7 @@
           <w:b/>
           <w:sz w:val="24"/>
         </w:rPr>
-        <w:t>Таблица 2</w:t>
-      </w:r>
-    </w:p>
-    <w:p>
-      <w:pPr>
-        <w:jc w:val="center"/>
-      </w:pPr>
-      <w:r>
-        <w:rPr>
-          <w:rFonts w:ascii="Times New Roman" w:hAnsi="Times New Roman" w:eastAsia="Times New Roman"/>
-          <w:b/>
-          <w:sz w:val="24"/>
-        </w:rPr>
-        <w:t>Ведомость проездов, тротуаров</w:t>
+        <w:t>Таблица 2 – Показатели участка</w:t>
       </w:r>
     </w:p>
     <w:tbl>
@@ -8286,11 +7917,11 @@
           <w:p>
             <w:r>
               <w:rPr>
-                <w:rFonts w:ascii="Times New Roman" w:hAnsi="Times New Roman"/>
+                <w:rFonts w:ascii="Times New Roman" w:hAnsi="Times New Roman" w:eastAsia="Times New Roman"/>
                 <w:b/>
                 <w:sz w:val="22"/>
               </w:rPr>
-              <w:t>Наименование</w:t>
+              <w:t>Показатель</w:t>
             </w:r>
           </w:p>
         </w:tc>
@@ -8301,11 +7932,11 @@
           <w:p>
             <w:r>
               <w:rPr>
-                <w:rFonts w:ascii="Times New Roman" w:hAnsi="Times New Roman"/>
+                <w:rFonts w:ascii="Times New Roman" w:hAnsi="Times New Roman" w:eastAsia="Times New Roman"/>
                 <w:b/>
                 <w:sz w:val="22"/>
               </w:rPr>
-              <w:t>Площадь покрытия, м²</w:t>
+              <w:t>Значение</w:t>
             </w:r>
           </w:p>
         </w:tc>
@@ -8318,10 +7949,11 @@
           <w:p>
             <w:r>
               <w:rPr>
-                <w:rFonts w:ascii="Times New Roman" w:hAnsi="Times New Roman"/>
-                <w:sz w:val="22"/>
-              </w:rPr>
-              <w:t>Асфальтобетонное покрытие проездов и стоянки</w:t>
+                <w:rFonts w:ascii="Times New Roman" w:hAnsi="Times New Roman" w:eastAsia="Times New Roman"/>
+                <w:b w:val="0"/>
+                <w:sz w:val="22"/>
+              </w:rPr>
+              <w:t>Площадь участка, м²</w:t>
             </w:r>
           </w:p>
         </w:tc>
@@ -8332,10 +7964,11 @@
           <w:p>
             <w:r>
               <w:rPr>
-                <w:rFonts w:ascii="Times New Roman" w:hAnsi="Times New Roman"/>
-                <w:sz w:val="22"/>
-              </w:rPr>
-              <w:t>620</w:t>
+                <w:rFonts w:ascii="Times New Roman" w:hAnsi="Times New Roman" w:eastAsia="Times New Roman"/>
+                <w:b w:val="0"/>
+                <w:sz w:val="22"/>
+              </w:rPr>
+              <w:t>1840</w:t>
             </w:r>
           </w:p>
         </w:tc>
@@ -8348,10 +7981,11 @@
           <w:p>
             <w:r>
               <w:rPr>
-                <w:rFonts w:ascii="Times New Roman" w:hAnsi="Times New Roman"/>
-                <w:sz w:val="22"/>
-              </w:rPr>
-              <w:t>Тротуарная плитка</w:t>
+                <w:rFonts w:ascii="Times New Roman" w:hAnsi="Times New Roman" w:eastAsia="Times New Roman"/>
+                <w:b w:val="0"/>
+                <w:sz w:val="22"/>
+              </w:rPr>
+              <w:t>Площадь застройки, м²</w:t>
             </w:r>
           </w:p>
         </w:tc>
@@ -8362,10 +7996,11 @@
           <w:p>
             <w:r>
               <w:rPr>
-                <w:rFonts w:ascii="Times New Roman" w:hAnsi="Times New Roman"/>
-                <w:sz w:val="22"/>
-              </w:rPr>
-              <w:t>185</w:t>
+                <w:rFonts w:ascii="Times New Roman" w:hAnsi="Times New Roman" w:eastAsia="Times New Roman"/>
+                <w:b w:val="0"/>
+                <w:sz w:val="22"/>
+              </w:rPr>
+              <w:t>312</w:t>
             </w:r>
           </w:p>
         </w:tc>
@@ -8378,10 +8013,11 @@
           <w:p>
             <w:r>
               <w:rPr>
-                <w:rFonts w:ascii="Times New Roman" w:hAnsi="Times New Roman"/>
-                <w:sz w:val="22"/>
-              </w:rPr>
-              <w:t>Асфальтобетонная отмостка</w:t>
+                <w:rFonts w:ascii="Times New Roman" w:hAnsi="Times New Roman" w:eastAsia="Times New Roman"/>
+                <w:b w:val="0"/>
+                <w:sz w:val="22"/>
+              </w:rPr>
+              <w:t>Общая площадь здания, м²</w:t>
             </w:r>
           </w:p>
         </w:tc>
@@ -8392,10 +8028,11 @@
           <w:p>
             <w:r>
               <w:rPr>
-                <w:rFonts w:ascii="Times New Roman" w:hAnsi="Times New Roman"/>
-                <w:sz w:val="22"/>
-              </w:rPr>
-              <w:t>96</w:t>
+                <w:rFonts w:ascii="Times New Roman" w:hAnsi="Times New Roman" w:eastAsia="Times New Roman"/>
+                <w:b w:val="0"/>
+                <w:sz w:val="22"/>
+              </w:rPr>
+              <w:t>288</w:t>
             </w:r>
           </w:p>
         </w:tc>
@@ -8408,11 +8045,11 @@
           <w:p>
             <w:r>
               <w:rPr>
-                <w:rFonts w:ascii="Times New Roman" w:hAnsi="Times New Roman"/>
-                <w:b/>
-                <w:sz w:val="22"/>
-              </w:rPr>
-              <w:t>Итого</w:t>
+                <w:rFonts w:ascii="Times New Roman" w:hAnsi="Times New Roman" w:eastAsia="Times New Roman"/>
+                <w:b w:val="0"/>
+                <w:sz w:val="22"/>
+              </w:rPr>
+              <w:t>Твёрдые покрытия, м²</w:t>
             </w:r>
           </w:p>
         </w:tc>
@@ -8423,142 +8060,11 @@
           <w:p>
             <w:r>
               <w:rPr>
-                <w:rFonts w:ascii="Times New Roman" w:hAnsi="Times New Roman"/>
-                <w:b/>
+                <w:rFonts w:ascii="Times New Roman" w:hAnsi="Times New Roman" w:eastAsia="Times New Roman"/>
+                <w:b w:val="0"/>
                 <w:sz w:val="22"/>
               </w:rPr>
               <w:t>901</w:t>
-            </w:r>
-          </w:p>
-        </w:tc>
-      </w:tr>
-    </w:tbl>
-    <w:p>
-      <w:pPr>
-        <w:spacing w:after="120"/>
-        <w:ind w:firstLine="709"/>
-        <w:jc w:val="both"/>
-      </w:pPr>
-      <w:r>
-        <w:rPr>
-          <w:rFonts w:ascii="Times New Roman" w:hAnsi="Times New Roman" w:eastAsia="Times New Roman"/>
-          <w:b w:val="0"/>
-          <w:sz w:val="24"/>
-        </w:rPr>
-        <w:t>Для обеспечения необходимых санитарно-гигиенических условий на площадке проектом предусмотрен комплекс мероприятий по благоустройству и озеленению.</w:t>
-      </w:r>
-    </w:p>
-    <w:p>
-      <w:pPr>
-        <w:spacing w:after="120"/>
-        <w:ind w:firstLine="709"/>
-        <w:jc w:val="both"/>
-      </w:pPr>
-      <w:r>
-        <w:rPr>
-          <w:rFonts w:ascii="Times New Roman" w:hAnsi="Times New Roman" w:eastAsia="Times New Roman"/>
-          <w:b w:val="0"/>
-          <w:sz w:val="24"/>
-        </w:rPr>
-        <w:t>Работы по озеленению выполняются после завершения основных строительно-монтажных работ и уборки строительного мусора.</w:t>
-      </w:r>
-    </w:p>
-    <w:p>
-      <w:pPr>
-        <w:jc w:val="center"/>
-      </w:pPr>
-      <w:r>
-        <w:rPr>
-          <w:rFonts w:ascii="Times New Roman" w:hAnsi="Times New Roman" w:eastAsia="Times New Roman"/>
-          <w:b/>
-          <w:sz w:val="24"/>
-        </w:rPr>
-        <w:t>Таблица 3</w:t>
-      </w:r>
-    </w:p>
-    <w:p>
-      <w:pPr>
-        <w:jc w:val="center"/>
-      </w:pPr>
-      <w:r>
-        <w:rPr>
-          <w:rFonts w:ascii="Times New Roman" w:hAnsi="Times New Roman" w:eastAsia="Times New Roman"/>
-          <w:b/>
-          <w:sz w:val="24"/>
-        </w:rPr>
-        <w:t>Площади планировочной организации земельного участка</w:t>
-      </w:r>
-    </w:p>
-    <w:tbl>
-      <w:tblPr>
-        <w:tblStyle w:val="a7"/>
-        <w:tblW w:type="auto" w:w="0"/>
-        <w:tblLook w:firstColumn="1" w:firstRow="1" w:lastColumn="0" w:lastRow="0" w:noHBand="0" w:noVBand="1" w:val="04A0"/>
-      </w:tblPr>
-      <w:tblGrid>
-        <w:gridCol w:w="2410"/>
-        <w:gridCol w:w="2410"/>
-        <w:gridCol w:w="2410"/>
-        <w:gridCol w:w="2410"/>
-      </w:tblGrid>
-      <w:tr>
-        <w:tc>
-          <w:tcPr>
-            <w:tcW w:type="dxa" w:w="2410"/>
-          </w:tcPr>
-          <w:p>
-            <w:r>
-              <w:rPr>
-                <w:rFonts w:ascii="Times New Roman" w:hAnsi="Times New Roman"/>
-                <w:b/>
-                <w:sz w:val="22"/>
-              </w:rPr>
-              <w:t>№ п/п</w:t>
-            </w:r>
-          </w:p>
-        </w:tc>
-        <w:tc>
-          <w:tcPr>
-            <w:tcW w:type="dxa" w:w="2410"/>
-          </w:tcPr>
-          <w:p>
-            <w:r>
-              <w:rPr>
-                <w:rFonts w:ascii="Times New Roman" w:hAnsi="Times New Roman"/>
-                <w:b/>
-                <w:sz w:val="22"/>
-              </w:rPr>
-              <w:t>Наименование</w:t>
-            </w:r>
-          </w:p>
-        </w:tc>
-        <w:tc>
-          <w:tcPr>
-            <w:tcW w:type="dxa" w:w="2410"/>
-          </w:tcPr>
-          <w:p>
-            <w:r>
-              <w:rPr>
-                <w:rFonts w:ascii="Times New Roman" w:hAnsi="Times New Roman"/>
-                <w:b/>
-                <w:sz w:val="22"/>
-              </w:rPr>
-              <w:t>Ед. изм.</w:t>
-            </w:r>
-          </w:p>
-        </w:tc>
-        <w:tc>
-          <w:tcPr>
-            <w:tcW w:type="dxa" w:w="2410"/>
-          </w:tcPr>
-          <w:p>
-            <w:r>
-              <w:rPr>
-                <w:rFonts w:ascii="Times New Roman" w:hAnsi="Times New Roman"/>
-                <w:b/>
-                <w:sz w:val="22"/>
-              </w:rPr>
-              <w:t>Количество</w:t>
             </w:r>
           </w:p>
         </w:tc>
@@ -8566,286 +8072,28 @@
       <w:tr>
         <w:tc>
           <w:tcPr>
-            <w:tcW w:type="dxa" w:w="2410"/>
+            <w:tcW w:type="dxa" w:w="4819"/>
           </w:tcPr>
           <w:p>
             <w:r>
               <w:rPr>
-                <w:rFonts w:ascii="Times New Roman" w:hAnsi="Times New Roman"/>
-                <w:sz w:val="22"/>
-              </w:rPr>
-              <w:t>1</w:t>
+                <w:rFonts w:ascii="Times New Roman" w:hAnsi="Times New Roman" w:eastAsia="Times New Roman"/>
+                <w:b w:val="0"/>
+                <w:sz w:val="22"/>
+              </w:rPr>
+              <w:t>Озеленение, м²</w:t>
             </w:r>
           </w:p>
         </w:tc>
         <w:tc>
           <w:tcPr>
-            <w:tcW w:type="dxa" w:w="2410"/>
+            <w:tcW w:type="dxa" w:w="4819"/>
           </w:tcPr>
           <w:p>
             <w:r>
               <w:rPr>
-                <w:rFonts w:ascii="Times New Roman" w:hAnsi="Times New Roman"/>
-                <w:sz w:val="22"/>
-              </w:rPr>
-              <w:t>Площадь участка в границах отвода</w:t>
-            </w:r>
-          </w:p>
-        </w:tc>
-        <w:tc>
-          <w:tcPr>
-            <w:tcW w:type="dxa" w:w="2410"/>
-          </w:tcPr>
-          <w:p>
-            <w:r>
-              <w:rPr>
-                <w:rFonts w:ascii="Times New Roman" w:hAnsi="Times New Roman"/>
-                <w:sz w:val="22"/>
-              </w:rPr>
-              <w:t>м²</w:t>
-            </w:r>
-          </w:p>
-        </w:tc>
-        <w:tc>
-          <w:tcPr>
-            <w:tcW w:type="dxa" w:w="2410"/>
-          </w:tcPr>
-          <w:p>
-            <w:r>
-              <w:rPr>
-                <w:rFonts w:ascii="Times New Roman" w:hAnsi="Times New Roman"/>
-                <w:sz w:val="22"/>
-              </w:rPr>
-              <w:t>1840</w:t>
-            </w:r>
-          </w:p>
-        </w:tc>
-      </w:tr>
-      <w:tr>
-        <w:tc>
-          <w:tcPr>
-            <w:tcW w:type="dxa" w:w="2410"/>
-          </w:tcPr>
-          <w:p>
-            <w:r>
-              <w:rPr>
-                <w:rFonts w:ascii="Times New Roman" w:hAnsi="Times New Roman"/>
-                <w:sz w:val="22"/>
-              </w:rPr>
-              <w:t>2</w:t>
-            </w:r>
-          </w:p>
-        </w:tc>
-        <w:tc>
-          <w:tcPr>
-            <w:tcW w:type="dxa" w:w="2410"/>
-          </w:tcPr>
-          <w:p>
-            <w:r>
-              <w:rPr>
-                <w:rFonts w:ascii="Times New Roman" w:hAnsi="Times New Roman"/>
-                <w:sz w:val="22"/>
-              </w:rPr>
-              <w:t>Площадь застройки</w:t>
-            </w:r>
-          </w:p>
-        </w:tc>
-        <w:tc>
-          <w:tcPr>
-            <w:tcW w:type="dxa" w:w="2410"/>
-          </w:tcPr>
-          <w:p>
-            <w:r>
-              <w:rPr>
-                <w:rFonts w:ascii="Times New Roman" w:hAnsi="Times New Roman"/>
-                <w:sz w:val="22"/>
-              </w:rPr>
-              <w:t>м²</w:t>
-            </w:r>
-          </w:p>
-        </w:tc>
-        <w:tc>
-          <w:tcPr>
-            <w:tcW w:type="dxa" w:w="2410"/>
-          </w:tcPr>
-          <w:p>
-            <w:r>
-              <w:rPr>
-                <w:rFonts w:ascii="Times New Roman" w:hAnsi="Times New Roman"/>
-                <w:sz w:val="22"/>
-              </w:rPr>
-              <w:t>312</w:t>
-            </w:r>
-          </w:p>
-        </w:tc>
-      </w:tr>
-      <w:tr>
-        <w:tc>
-          <w:tcPr>
-            <w:tcW w:type="dxa" w:w="2410"/>
-          </w:tcPr>
-          <w:p>
-            <w:r>
-              <w:rPr>
-                <w:rFonts w:ascii="Times New Roman" w:hAnsi="Times New Roman"/>
-                <w:sz w:val="22"/>
-              </w:rPr>
-              <w:t>3</w:t>
-            </w:r>
-          </w:p>
-        </w:tc>
-        <w:tc>
-          <w:tcPr>
-            <w:tcW w:type="dxa" w:w="2410"/>
-          </w:tcPr>
-          <w:p>
-            <w:r>
-              <w:rPr>
-                <w:rFonts w:ascii="Times New Roman" w:hAnsi="Times New Roman"/>
-                <w:sz w:val="22"/>
-              </w:rPr>
-              <w:t>Площадь здания (общая)</w:t>
-            </w:r>
-          </w:p>
-        </w:tc>
-        <w:tc>
-          <w:tcPr>
-            <w:tcW w:type="dxa" w:w="2410"/>
-          </w:tcPr>
-          <w:p>
-            <w:r>
-              <w:rPr>
-                <w:rFonts w:ascii="Times New Roman" w:hAnsi="Times New Roman"/>
-                <w:sz w:val="22"/>
-              </w:rPr>
-              <w:t>м²</w:t>
-            </w:r>
-          </w:p>
-        </w:tc>
-        <w:tc>
-          <w:tcPr>
-            <w:tcW w:type="dxa" w:w="2410"/>
-          </w:tcPr>
-          <w:p>
-            <w:r>
-              <w:rPr>
-                <w:rFonts w:ascii="Times New Roman" w:hAnsi="Times New Roman"/>
-                <w:sz w:val="22"/>
-              </w:rPr>
-              <w:t>288</w:t>
-            </w:r>
-          </w:p>
-        </w:tc>
-      </w:tr>
-      <w:tr>
-        <w:tc>
-          <w:tcPr>
-            <w:tcW w:type="dxa" w:w="2410"/>
-          </w:tcPr>
-          <w:p>
-            <w:r>
-              <w:rPr>
-                <w:rFonts w:ascii="Times New Roman" w:hAnsi="Times New Roman"/>
-                <w:sz w:val="22"/>
-              </w:rPr>
-              <w:t>4</w:t>
-            </w:r>
-          </w:p>
-        </w:tc>
-        <w:tc>
-          <w:tcPr>
-            <w:tcW w:type="dxa" w:w="2410"/>
-          </w:tcPr>
-          <w:p>
-            <w:r>
-              <w:rPr>
-                <w:rFonts w:ascii="Times New Roman" w:hAnsi="Times New Roman"/>
-                <w:sz w:val="22"/>
-              </w:rPr>
-              <w:t>Площадь с твёрдым покрытием</w:t>
-            </w:r>
-          </w:p>
-        </w:tc>
-        <w:tc>
-          <w:tcPr>
-            <w:tcW w:type="dxa" w:w="2410"/>
-          </w:tcPr>
-          <w:p>
-            <w:r>
-              <w:rPr>
-                <w:rFonts w:ascii="Times New Roman" w:hAnsi="Times New Roman"/>
-                <w:sz w:val="22"/>
-              </w:rPr>
-              <w:t>м²</w:t>
-            </w:r>
-          </w:p>
-        </w:tc>
-        <w:tc>
-          <w:tcPr>
-            <w:tcW w:type="dxa" w:w="2410"/>
-          </w:tcPr>
-          <w:p>
-            <w:r>
-              <w:rPr>
-                <w:rFonts w:ascii="Times New Roman" w:hAnsi="Times New Roman"/>
-                <w:sz w:val="22"/>
-              </w:rPr>
-              <w:t>901</w:t>
-            </w:r>
-          </w:p>
-        </w:tc>
-      </w:tr>
-      <w:tr>
-        <w:tc>
-          <w:tcPr>
-            <w:tcW w:type="dxa" w:w="2410"/>
-          </w:tcPr>
-          <w:p>
-            <w:r>
-              <w:rPr>
-                <w:rFonts w:ascii="Times New Roman" w:hAnsi="Times New Roman"/>
-                <w:sz w:val="22"/>
-              </w:rPr>
-              <w:t>5</w:t>
-            </w:r>
-          </w:p>
-        </w:tc>
-        <w:tc>
-          <w:tcPr>
-            <w:tcW w:type="dxa" w:w="2410"/>
-          </w:tcPr>
-          <w:p>
-            <w:r>
-              <w:rPr>
-                <w:rFonts w:ascii="Times New Roman" w:hAnsi="Times New Roman"/>
-                <w:sz w:val="22"/>
-              </w:rPr>
-              <w:t>Площадь озеленения</w:t>
-            </w:r>
-          </w:p>
-        </w:tc>
-        <w:tc>
-          <w:tcPr>
-            <w:tcW w:type="dxa" w:w="2410"/>
-          </w:tcPr>
-          <w:p>
-            <w:r>
-              <w:rPr>
-                <w:rFonts w:ascii="Times New Roman" w:hAnsi="Times New Roman"/>
-                <w:sz w:val="22"/>
-              </w:rPr>
-              <w:t>м²</w:t>
-            </w:r>
-          </w:p>
-        </w:tc>
-        <w:tc>
-          <w:tcPr>
-            <w:tcW w:type="dxa" w:w="2410"/>
-          </w:tcPr>
-          <w:p>
-            <w:r>
-              <w:rPr>
-                <w:rFonts w:ascii="Times New Roman" w:hAnsi="Times New Roman"/>
+                <w:rFonts w:ascii="Times New Roman" w:hAnsi="Times New Roman" w:eastAsia="Times New Roman"/>
+                <w:b w:val="0"/>
                 <w:sz w:val="22"/>
               </w:rPr>
               <w:t>627</w:t>
@@ -8854,8 +8102,10 @@
         </w:tc>
       </w:tr>
     </w:tbl>
+    <w:p/>
     <w:p>
       <w:pPr>
+        <w:spacing w:after="120"/>
         <w:jc w:val="left"/>
       </w:pPr>
       <w:r>
@@ -8864,7 +8114,7 @@
           <w:b/>
           <w:sz w:val="24"/>
         </w:rPr>
-        <w:t>2.2. Объемно-планировочное решение</w:t>
+        <w:t>2.5. Объёмно-планировочные и конструктивные решения</w:t>
       </w:r>
     </w:p>
     <w:p>
@@ -8879,7 +8129,7 @@
           <w:b w:val="0"/>
           <w:sz w:val="24"/>
         </w:rPr>
-        <w:t>Административно-бытовое здание производственного участка с диспетчерской и площадкой ГРПШ представляет собой прямоугольное в плане одноэтажное сооружение с габаритами в осях 24,0 × 12,0 м, без подвала, с техническим чердаком для разводки инженерных сетей. Высота помещений от пола до низа конструкций покрытия составляет 3,3 м.</w:t>
+        <w:t>Здание одноэтажное, без подвала, с техническим чердаком. Высота помещений – 3,3 м. В плане: кабинет начальника участка, диспетчерская, комната персонала, раздевалки с душевыми, санузлы, помещение приёма пищи, кладовая, электрощитовая и тепловой узел. Диспетчерская отделена от «шумных» бытовых помещений – это сразу закрывает вопрос акустического режима.</w:t>
       </w:r>
     </w:p>
     <w:p>
@@ -8894,7 +8144,7 @@
           <w:b w:val="0"/>
           <w:sz w:val="24"/>
         </w:rPr>
-        <w:t>В здании размещаются: кабинет начальника участка; помещение диспетчерской; комната персонала; раздевалки с душевыми; санузлы; помещение для приёма пищи; кладовая инвентаря; электрощитовая; тепловой узел.</w:t>
+        <w:t>Конструктив: несущие наружные и внутренние стены; ленточный монолитный фундамент на естественном основании с песчано-гравийной подготовкой; стены из газобетона 400 мм с минватой и вентилируемым фасадом; чердачное перекрытие – многопустотные плиты 220 мм; кровля двускатная по деревянным стропилам, покрытие – металлочерепица. Окна ПВХ с двухкамерным стеклопакетом. Под ГРПШ и ограждение – отдельные фундаменты.</w:t>
       </w:r>
     </w:p>
     <w:p>
@@ -8909,7 +8159,22 @@
           <w:b w:val="0"/>
           <w:sz w:val="24"/>
         </w:rPr>
-        <w:t>Планировка обеспечивает разделение административных и бытовых зон, а также удобный выход персонала к площадке ГРПШ. Площадка ГРПШ имеет самостоятельное ограждение, покрытие из бетонных плит и организованный подъезд для обслуживания.</w:t>
+        <w:t>По классам принято: капитальность II, ответственность II, огнестойкость II, функциональная пожарная опасность Ф4.3. Для административно-бытового корпуса газового участка это согласуется с назначением и численностью постоянно пребывающего персонала.</w:t>
+      </w:r>
+    </w:p>
+    <w:p>
+      <w:pPr>
+        <w:spacing w:after="120"/>
+        <w:ind w:firstLine="709"/>
+        <w:jc w:val="left"/>
+      </w:pPr>
+      <w:r>
+        <w:rPr>
+          <w:rFonts w:ascii="Times New Roman" w:hAnsi="Times New Roman" w:eastAsia="Times New Roman"/>
+          <w:b/>
+          <w:sz w:val="24"/>
+        </w:rPr>
+        <w:t>2.6. Инженерные системы, режимы помещений и отделка</w:t>
       </w:r>
     </w:p>
     <w:p>
@@ -8924,7 +8189,7 @@
           <w:b w:val="0"/>
           <w:sz w:val="24"/>
         </w:rPr>
-        <w:t>Нормативная освещённость рабочих мест, служебно-бытовых и административных помещений обеспечивается естественным, искусственным и смешанным освещением.</w:t>
+        <w:t>Теплоснабжение – от локального источника базы через ИТП; отопление водяное двухтрубное; вентиляция приточно-вытяжная с механическим побуждением в диспетчерской, бытовых и санузлах. Водопровод и канализация – от сетей площадки. Световой режим рабочих мест обеспечивается окнами и светодиодным освещением.</w:t>
       </w:r>
     </w:p>
     <w:p>
@@ -8939,72 +8204,7 @@
           <w:b w:val="0"/>
           <w:sz w:val="24"/>
         </w:rPr>
-        <w:t>Естественное освещение принято через оконные проёмы, искусственное освещение выполняется светодиодными светильниками.</w:t>
-      </w:r>
-    </w:p>
-    <w:p>
-      <w:pPr>
-        <w:jc w:val="both"/>
-      </w:pPr>
-      <w:r>
-        <w:rPr>
-          <w:rFonts w:ascii="Times New Roman" w:hAnsi="Times New Roman" w:eastAsia="Times New Roman"/>
-          <w:b w:val="0"/>
-          <w:sz w:val="24"/>
-        </w:rPr>
-        <w:t>Класс здания по капитальности – второй (II).</w:t>
-      </w:r>
-    </w:p>
-    <w:p>
-      <w:pPr>
-        <w:jc w:val="both"/>
-      </w:pPr>
-      <w:r>
-        <w:rPr>
-          <w:rFonts w:ascii="Times New Roman" w:hAnsi="Times New Roman" w:eastAsia="Times New Roman"/>
-          <w:b w:val="0"/>
-          <w:sz w:val="24"/>
-        </w:rPr>
-        <w:t>Степень ответственности здания – II.</w:t>
-      </w:r>
-    </w:p>
-    <w:p>
-      <w:pPr>
-        <w:jc w:val="both"/>
-      </w:pPr>
-      <w:r>
-        <w:rPr>
-          <w:rFonts w:ascii="Times New Roman" w:hAnsi="Times New Roman" w:eastAsia="Times New Roman"/>
-          <w:b w:val="0"/>
-          <w:sz w:val="24"/>
-        </w:rPr>
-        <w:t>Степень огнестойкости здания – II.</w:t>
-      </w:r>
-    </w:p>
-    <w:p>
-      <w:pPr>
-        <w:jc w:val="both"/>
-      </w:pPr>
-      <w:r>
-        <w:rPr>
-          <w:rFonts w:ascii="Times New Roman" w:hAnsi="Times New Roman" w:eastAsia="Times New Roman"/>
-          <w:b w:val="0"/>
-          <w:sz w:val="24"/>
-        </w:rPr>
-        <w:t>Класс функциональной пожарной опасности – Ф4.3.</w:t>
-      </w:r>
-    </w:p>
-    <w:p>
-      <w:pPr>
-        <w:jc w:val="left"/>
-      </w:pPr>
-      <w:r>
-        <w:rPr>
-          <w:rFonts w:ascii="Times New Roman" w:hAnsi="Times New Roman" w:eastAsia="Times New Roman"/>
-          <w:b/>
-          <w:sz w:val="24"/>
-        </w:rPr>
-        <w:t>2.3. Конструктивное решение</w:t>
+        <w:t>Тепло-влажностный режим ограждающих конструкций оценивался именно через связку «климат Новгорода – утеплённая стена – чердачное перекрытие». При расчётных внутренних параметрах конденсация на внутренней поверхности не должна возникать. Для диспетчерской дополнительно учтены звукопоглощающие потолочные панели.</w:t>
       </w:r>
     </w:p>
     <w:p>
@@ -9019,7 +8219,22 @@
           <w:b w:val="0"/>
           <w:sz w:val="24"/>
         </w:rPr>
-        <w:t>Конструктивная схема здания – стеновая с несущими наружными и внутренними стенами.</w:t>
+        <w:t>Отделка принята производственная, без «выставочных» решений: цоколь – керамогранит; фасад – кассеты нейтрального серого цвета; внутри в рабочих кабинетах – окраска, подвесной потолок и коммерческий линолеум; в мокрых зонах – плитка; в техпомещениях – окраска и нескользящий керамогранит.</w:t>
+      </w:r>
+    </w:p>
+    <w:p>
+      <w:pPr>
+        <w:spacing w:after="120"/>
+        <w:ind w:firstLine="709"/>
+        <w:jc w:val="left"/>
+      </w:pPr>
+      <w:r>
+        <w:rPr>
+          <w:rFonts w:ascii="Times New Roman" w:hAnsi="Times New Roman" w:eastAsia="Times New Roman"/>
+          <w:b/>
+          <w:sz w:val="24"/>
+        </w:rPr>
+        <w:t>2.7. Требования НТД, изыскания и доступность</w:t>
       </w:r>
     </w:p>
     <w:p>
@@ -9034,7 +8249,7 @@
           <w:b w:val="0"/>
           <w:sz w:val="24"/>
         </w:rPr>
-        <w:t>Фундаменты – ленточные монолитные железобетонные на естественном основании с устройством песчано-гравийной подготовки. В зоне площадки ГРПШ предусмотрены отдельные фундаменты под оборудование и ограждение.</w:t>
+        <w:t>По проектной документации проверялась логика соответствия нормам: состав изысканий для площадки (геодезия/геология как минимум для фундаментов и вертикальной планировки), разрывы до ГРПШ, организация проездов, требования СП 42.13330.2016 к планировке и СП 59.13330.2020 к МГН. Для входа приняты пандус уклоном не более 8 %, дверь не уже 0,9 м, понижение бортов на пересечениях и одно машино-место МГН у входа.</w:t>
       </w:r>
     </w:p>
     <w:p>
@@ -9049,7 +8264,22 @@
           <w:b w:val="0"/>
           <w:sz w:val="24"/>
         </w:rPr>
-        <w:t>Наружные стены – из блоков автоклавного газобетона толщиной 400 мм с наружным утеплением минераловатными плитами и устройством вентилируемого фасада.</w:t>
+        <w:t>Отдельно отмечено: для объектов ГРО недостаточно «просто построить здание». Нужно заранее заложить удобный доступ к ГРПШ для обслуживания, возможность осмотра конструкций и инженерных систем, а также понятный контур ответственности участка после ввода.</w:t>
+      </w:r>
+    </w:p>
+    <w:p>
+      <w:pPr>
+        <w:spacing w:after="120"/>
+        <w:ind w:firstLine="709"/>
+        <w:jc w:val="left"/>
+      </w:pPr>
+      <w:r>
+        <w:rPr>
+          <w:rFonts w:ascii="Times New Roman" w:hAnsi="Times New Roman" w:eastAsia="Times New Roman"/>
+          <w:b/>
+          <w:sz w:val="24"/>
+        </w:rPr>
+        <w:t>2.8. Техническая эксплуатация и надзор</w:t>
       </w:r>
     </w:p>
     <w:p>
@@ -9064,7 +8294,22 @@
           <w:b w:val="0"/>
           <w:sz w:val="24"/>
         </w:rPr>
-        <w:t>Внутренние перегородки – газобетонные и кирпичные. Перекрытие технического чердака – сборные железобетонные многопустотные плиты толщиной 220 мм.</w:t>
+        <w:t>После ввода объект обслуживает производственный участок. В регламент входят осмотры конструкций, кровли, отмостки, инженерных систем и площадки ГРПШ; сезонная подготовка отопления; проверка вентиляции и электроустановок. Технический надзор на строительстве контролирует соответствие проекту и требованиям промышленной безопасности. Результат ремонта оценивается не по факту «работы выполнены», а по восстановлению эксплуатационных показателей и наличию исполнительной документации.</w:t>
+      </w:r>
+    </w:p>
+    <w:p>
+      <w:pPr>
+        <w:spacing w:after="120"/>
+        <w:ind w:firstLine="709"/>
+        <w:jc w:val="left"/>
+      </w:pPr>
+      <w:r>
+        <w:rPr>
+          <w:rFonts w:ascii="Times New Roman" w:hAnsi="Times New Roman" w:eastAsia="Times New Roman"/>
+          <w:b/>
+          <w:sz w:val="24"/>
+        </w:rPr>
+        <w:t>Выводы по практике</w:t>
       </w:r>
     </w:p>
     <w:p>
@@ -9079,7 +8324,7 @@
           <w:b w:val="0"/>
           <w:sz w:val="24"/>
         </w:rPr>
-        <w:t>Кровля – двускатная по деревянным стропилам с покрытием из металлочерепицы и утеплением чердачного перекрытия.</w:t>
+        <w:t>В результате практики на базе АО «Газпром газораспределение Великий Новгород» мной разобрана цепочка: исходные данные и изыскания → нормы → проектные решения АБК и площадки ГРПШ → режимы помещений → дальнейшая эксплуатация. Показано, как типовой объект газораспределительной инфраструктуры позволяет закрыть все пункты индивидуального задания без формального перечисления «изучено всё подряд».</w:t>
       </w:r>
     </w:p>
     <w:p>
@@ -9094,257 +8339,34 @@
           <w:b w:val="0"/>
           <w:sz w:val="24"/>
         </w:rPr>
-        <w:t>Окна из профилей ПВХ, заполнение – двухкамерные стеклопакеты. Наружные двери – металлические утеплённые.</w:t>
+        <w:t>Программа учебной (изыскательской) практики выполнена. Материалы систематизированы в отчёте.</w:t>
       </w:r>
     </w:p>
     <w:p>
       <w:pPr>
+        <w:spacing w:after="120"/>
+        <w:ind w:firstLine="709"/>
         <w:jc w:val="left"/>
       </w:pPr>
       <w:r>
         <w:rPr>
           <w:rFonts w:ascii="Times New Roman" w:hAnsi="Times New Roman" w:eastAsia="Times New Roman"/>
-          <w:b/>
-          <w:sz w:val="24"/>
-        </w:rPr>
-        <w:t>2.4. Наружная и внутренняя отделка</w:t>
+          <w:b w:val="0"/>
+          <w:sz w:val="24"/>
+        </w:rPr>
+        <w:t>«16» августа 2026 г.</w:t>
       </w:r>
     </w:p>
     <w:p>
       <w:pPr>
-        <w:jc w:val="both"/>
-      </w:pPr>
-      <w:r>
-        <w:rPr>
-          <w:rFonts w:ascii="Times New Roman" w:hAnsi="Times New Roman" w:eastAsia="Times New Roman"/>
-          <w:b/>
-          <w:sz w:val="24"/>
-        </w:rPr>
-        <w:t>Наружная отделка</w:t>
-      </w:r>
-    </w:p>
-    <w:p>
-      <w:pPr>
         <w:spacing w:after="120"/>
         <w:ind w:firstLine="709"/>
-        <w:jc w:val="both"/>
+        <w:jc w:val="left"/>
       </w:pPr>
       <w:r>
         <w:rPr>
           <w:rFonts w:ascii="Times New Roman" w:hAnsi="Times New Roman" w:eastAsia="Times New Roman"/>
           <w:b w:val="0"/>
-          <w:sz w:val="24"/>
-        </w:rPr>
-        <w:t>Цоколь выполнен с облицовкой керамогранитом. Стены – вентилируемый фасад с кассетами нейтрального серого цвета. Кровля – металлочерепица.</w:t>
-      </w:r>
-    </w:p>
-    <w:p>
-      <w:pPr>
-        <w:jc w:val="both"/>
-      </w:pPr>
-      <w:r>
-        <w:rPr>
-          <w:rFonts w:ascii="Times New Roman" w:hAnsi="Times New Roman" w:eastAsia="Times New Roman"/>
-          <w:b/>
-          <w:sz w:val="24"/>
-        </w:rPr>
-        <w:t>Внутренняя отделка</w:t>
-      </w:r>
-    </w:p>
-    <w:p>
-      <w:pPr>
-        <w:spacing w:after="120"/>
-        <w:ind w:firstLine="709"/>
-        <w:jc w:val="both"/>
-      </w:pPr>
-      <w:r>
-        <w:rPr>
-          <w:rFonts w:ascii="Times New Roman" w:hAnsi="Times New Roman" w:eastAsia="Times New Roman"/>
-          <w:b w:val="0"/>
-          <w:sz w:val="24"/>
-        </w:rPr>
-        <w:t>В административных помещениях и диспетчерской стены окрашиваются, потолки – подвесные, полы – коммерческий линолеум. В бытовых помещениях и санузлах применяется керамическая плитка. В электрощитовой и тепловом узле – окраска по штукатурке, полы из керамогранита с нескользящей поверхностью.</w:t>
-      </w:r>
-    </w:p>
-    <w:p>
-      <w:pPr>
-        <w:jc w:val="left"/>
-      </w:pPr>
-      <w:r>
-        <w:rPr>
-          <w:rFonts w:ascii="Times New Roman" w:hAnsi="Times New Roman" w:eastAsia="Times New Roman"/>
-          <w:b/>
-          <w:sz w:val="24"/>
-        </w:rPr>
-        <w:t>2.5. Обеспечение условий для маломобильной группы населения</w:t>
-      </w:r>
-    </w:p>
-    <w:p>
-      <w:pPr>
-        <w:spacing w:after="120"/>
-        <w:ind w:firstLine="709"/>
-        <w:jc w:val="both"/>
-      </w:pPr>
-      <w:r>
-        <w:rPr>
-          <w:rFonts w:ascii="Times New Roman" w:hAnsi="Times New Roman" w:eastAsia="Times New Roman"/>
-          <w:b w:val="0"/>
-          <w:sz w:val="24"/>
-        </w:rPr>
-        <w:t>При проектировании объекта предусмотрены мероприятия по обеспечению доступа маломобильных групп населения согласно требованиям СП 59.13330.2020:</w:t>
-      </w:r>
-    </w:p>
-    <w:p>
-      <w:pPr>
-        <w:jc w:val="both"/>
-      </w:pPr>
-      <w:r>
-        <w:rPr>
-          <w:rFonts w:ascii="Times New Roman" w:hAnsi="Times New Roman" w:eastAsia="Times New Roman"/>
-          <w:b w:val="0"/>
-          <w:sz w:val="24"/>
-        </w:rPr>
-        <w:t>уклоны пешеходных дорожек не превышают нормативных значений;</w:t>
-      </w:r>
-    </w:p>
-    <w:p>
-      <w:pPr>
-        <w:jc w:val="both"/>
-      </w:pPr>
-      <w:r>
-        <w:rPr>
-          <w:rFonts w:ascii="Times New Roman" w:hAnsi="Times New Roman" w:eastAsia="Times New Roman"/>
-          <w:b w:val="0"/>
-          <w:sz w:val="24"/>
-        </w:rPr>
-        <w:t>в местах пересечения тротуаров с проезжей частью предусмотрено понижение бортового камня;</w:t>
-      </w:r>
-    </w:p>
-    <w:p>
-      <w:pPr>
-        <w:jc w:val="both"/>
-      </w:pPr>
-      <w:r>
-        <w:rPr>
-          <w:rFonts w:ascii="Times New Roman" w:hAnsi="Times New Roman" w:eastAsia="Times New Roman"/>
-          <w:b w:val="0"/>
-          <w:sz w:val="24"/>
-        </w:rPr>
-        <w:t>ширина пешеходных дорожек принята не менее 1,5 м;</w:t>
-      </w:r>
-    </w:p>
-    <w:p>
-      <w:pPr>
-        <w:jc w:val="both"/>
-      </w:pPr>
-      <w:r>
-        <w:rPr>
-          <w:rFonts w:ascii="Times New Roman" w:hAnsi="Times New Roman" w:eastAsia="Times New Roman"/>
-          <w:b w:val="0"/>
-          <w:sz w:val="24"/>
-        </w:rPr>
-        <w:t>для подъема на площадку перед входом предусмотрен пандус шириной 1,0 м с уклоном не более 8%;</w:t>
-      </w:r>
-    </w:p>
-    <w:p>
-      <w:pPr>
-        <w:jc w:val="both"/>
-      </w:pPr>
-      <w:r>
-        <w:rPr>
-          <w:rFonts w:ascii="Times New Roman" w:hAnsi="Times New Roman" w:eastAsia="Times New Roman"/>
-          <w:b w:val="0"/>
-          <w:sz w:val="24"/>
-        </w:rPr>
-        <w:t>вход в здание оборудован дверью шириной не менее 0,9 м;</w:t>
-      </w:r>
-    </w:p>
-    <w:p>
-      <w:pPr>
-        <w:jc w:val="both"/>
-      </w:pPr>
-      <w:r>
-        <w:rPr>
-          <w:rFonts w:ascii="Times New Roman" w:hAnsi="Times New Roman" w:eastAsia="Times New Roman"/>
-          <w:b w:val="0"/>
-          <w:sz w:val="24"/>
-        </w:rPr>
-        <w:t>для МГН предусмотрено 1 машино-место, максимально приближенное к входу в здание.</w:t>
-      </w:r>
-    </w:p>
-    <w:p>
-      <w:pPr>
-        <w:jc w:val="left"/>
-      </w:pPr>
-      <w:r>
-        <w:rPr>
-          <w:rFonts w:ascii="Times New Roman" w:hAnsi="Times New Roman" w:eastAsia="Times New Roman"/>
-          <w:b/>
-          <w:sz w:val="24"/>
-        </w:rPr>
-        <w:t>Заключение</w:t>
-      </w:r>
-    </w:p>
-    <w:p>
-      <w:pPr>
-        <w:spacing w:after="120"/>
-        <w:ind w:firstLine="709"/>
-        <w:jc w:val="both"/>
-      </w:pPr>
-      <w:r>
-        <w:rPr>
-          <w:rFonts w:ascii="Times New Roman" w:hAnsi="Times New Roman" w:eastAsia="Times New Roman"/>
-          <w:b w:val="0"/>
-          <w:sz w:val="24"/>
-        </w:rPr>
-        <w:t>Во время практики мной, Русаков Владимир Сергеевич, изучена деятельность АО «Газпром газораспределение Великий Новгород» и проанализированы материалы проекта строительства административно-бытового здания производственного участка с помещением диспетчерской и площадкой газорегуляторного пункта шкафного типа (ГРПШ) в западной промышленной зоне г. Великий Новгород.</w:t>
-      </w:r>
-    </w:p>
-    <w:p>
-      <w:pPr>
-        <w:spacing w:after="120"/>
-        <w:ind w:firstLine="709"/>
-        <w:jc w:val="both"/>
-      </w:pPr>
-      <w:r>
-        <w:rPr>
-          <w:rFonts w:ascii="Times New Roman" w:hAnsi="Times New Roman" w:eastAsia="Times New Roman"/>
-          <w:b w:val="0"/>
-          <w:sz w:val="24"/>
-        </w:rPr>
-        <w:t>В ходе практики изучены климатологическая характеристика места строительства, схема планировочной организации земельного участка, объёмно-планировочные и конструктивные решения, отделка, мероприятия для МГН, а также вопросы технической эксплуатации и надзора. Индивидуальное задание выполнено в полном объёме.</w:t>
-      </w:r>
-    </w:p>
-    <w:p>
-      <w:pPr>
-        <w:jc w:val="both"/>
-      </w:pPr>
-      <w:r>
-        <w:rPr>
-          <w:rFonts w:ascii="Times New Roman" w:hAnsi="Times New Roman" w:eastAsia="Times New Roman"/>
-          <w:b w:val="0"/>
-          <w:sz w:val="24"/>
-        </w:rPr>
-        <w:t>Программа учебной (изыскательской) практики выполнена в полном объёме.</w:t>
-      </w:r>
-    </w:p>
-    <w:p>
-      <w:pPr>
-        <w:jc w:val="left"/>
-      </w:pPr>
-      <w:r>
-        <w:rPr>
-          <w:rFonts w:ascii="Times New Roman" w:hAnsi="Times New Roman" w:eastAsia="Times New Roman"/>
-          <w:b w:val="0"/>
-          <w:sz w:val="24"/>
-        </w:rPr>
-        <w:t>«16» августа 2026 г.</w:t>
-      </w:r>
-    </w:p>
-    <w:p>
-      <w:r>
-        <w:rPr>
-          <w:rFonts w:ascii="Times New Roman" w:hAnsi="Times New Roman"/>
           <w:sz w:val="24"/>
         </w:rPr>
         <w:t>Обучающийся ________________     Русаков Владимир Сергеевич</w:t>
@@ -9801,7 +8823,7 @@
                 <w:sz w:val="22"/>
                 <w:szCs w:val="22"/>
               </w:rPr>
-              <w:t>Изучены основные понятия, определяющие тепло-влажностный, акустический и световой режимы помещений административно-бытового здания производственного участка с диспетчерской и площадкой ГРПШ; изучены законы, определяющие процессы передачи теплоты, влаги, воздуха, звука и света в ограждающих конструкциях административно-бытового здания производственного участка с диспетчерской и площадкой ГРПШ.</w:t>
+              <w:t>По режимам помещений: для климата II В и внутренних условий диспетчерской/кабинетов подтверждена необходимость утеплённых ограждающих конструкций и отдельного акустического решения диспетчерской; световой режим обеспечивается окнами и светодиодным освещением.</w:t>
             </w:r>
             <w:r>
               <w:rPr>
@@ -10047,7 +9069,7 @@
                 <w:sz w:val="22"/>
                 <w:szCs w:val="22"/>
               </w:rPr>
-              <w:t>Изучены теоретические основы и нормативная база жилищно-коммунального хозяйства в рамках прохождения практики; изучены методы и методики решения задач профессиональной деятельности в области строительства административно-бытового здания производственного участка с диспетчерской и площадкой ГРПШ.</w:t>
+              <w:t>По нормативной базе строительства и ЖКХ: требования к содержанию производственных зданий и объектов газового хозяйства связаны с безопасностью и непрерывностью эксплуатации; методы решения задач проиллюстрированы на связке «норма – проект – обслуживание».</w:t>
             </w:r>
             <w:r>
               <w:rPr>
@@ -10243,7 +9265,7 @@
                 <w:sz w:val="22"/>
                 <w:szCs w:val="22"/>
               </w:rPr>
-              <w:t>Изучены основные требования нормативно-правовых и нормативно-технических документов, предъявляемых к выполнению инженерных изысканий в строительстве административно-бытовое здание производственного участка с диспетчерской и площадкой ГРПШ; изучена проектная строительная документация на предмет ее соответствия требованиям нормативно-правовых и нормативно-технических документов.</w:t>
+              <w:t>По НТД и проектной документации: для выбранного объекта прослежены требования к размещению ГРПШ, проездам, разрывам и доступности; комплект решений АБК сопоставлен с назначением здания участка.</w:t>
             </w:r>
             <w:r>
               <w:rPr>
@@ -10446,7 +9468,7 @@
                 <w:sz w:val="22"/>
                 <w:szCs w:val="22"/>
               </w:rPr>
-              <w:t>Изучен состав работ по инженерным изысканиям, необходимых для строительства административно-бытового здания производственного участка с диспетчерской и площадкой ГРПШ; изучены основы инженерно-геологических изысканий для строительства административно-бытового здания производственного участка с диспетчерской и площадкой ГРПШ.</w:t>
+              <w:t>По инженерным изысканиям: для ленточных фундаментов и вертикальной планировки достаточны данные о спокойном рельефе и естественном основании; геодезическая подоснова использована для организации водоотвода и отметок.</w:t>
             </w:r>
             <w:r>
               <w:rPr>
@@ -10663,7 +9685,7 @@
                 <w:sz w:val="22"/>
                 <w:szCs w:val="22"/>
               </w:rPr>
-              <w:t>Изучены исходные данные, необходимые для проектирования здания и инженерных систем жизнеобеспечения административно-бытового здания производственного участка с диспетчерской и площадкой ГРПШ; изучены основные средства и методы составления проектной документации, в том числе с использованием средств автоматизированного проектирования и вычислительных программных комплексов; изучены расчётное и технико-экономическое обоснование режимов работы инженерных систем жизнеобеспечения административно-бытового здания производственного участка с диспетчерской и площадкой ГРПШ; изучены методы оценки основных технико-экономических показателей проектных решений административно-бытового здания производственного участка с диспетчерской и площадкой ГРПШ.</w:t>
+              <w:t>По проектированию и ТЭП: собраны исходные данные (климат, пятно участка, функциональная программа); оценены показатели таблицы 2; инженерные системы и режимы работы отопления/вентиляции увязаны с длительным отопительным периодом региона.</w:t>
             </w:r>
             <w:r>
               <w:rPr>
@@ -11017,7 +10039,7 @@
                 <w:sz w:val="22"/>
                 <w:szCs w:val="22"/>
               </w:rPr>
-              <w:t>Изучен регламент работ по технической эксплуатации (техническому обслуживанию или ремонту) административно-бытового здания производственного участка с диспетчерской и площадкой ГРПШ; изучены основы технического надзора, экспертизы объектов строительства и оценки технического состояния административно-бытового здания производственного участка с диспетчерской и площадкой ГРПШ; изучены способы оценки результатов ремонтных работ в области технической эксплуатации и ремонта зданий.</w:t>
+              <w:t>По эксплуатации и надзору: сформирован понятный регламент осмотров АБК и площадки ГРПШ; показано, как технический надзор и оценка ремонта опираются на проект, нормы безопасности и исполнительную документацию.</w:t>
             </w:r>
             <w:r>
               <w:rPr>

</xml_diff>